<commit_message>
add: send email change: render docx
</commit_message>
<xml_diff>
--- a/backend_main/audio_report/media/templates/meeting_template.docx
+++ b/backend_main/audio_report/media/templates/meeting_template.docx
@@ -157,85 +157,6 @@
       <w:pPr>
         <w:rPr>
           <w:rFonts w:ascii="Arial" w:hAnsi="Arial" w:cs="Arial"/>
-          <w:sz w:val="28"/>
-          <w:szCs w:val="28"/>
-        </w:rPr>
-      </w:pPr>
-      <w:r>
-        <w:rPr>
-          <w:rFonts w:ascii="Arial" w:hAnsi="Arial" w:cs="Arial"/>
-          <w:sz w:val="28"/>
-          <w:szCs w:val="28"/>
-        </w:rPr>
-        <w:t>Ключевые вопросы:</w:t>
-      </w:r>
-    </w:p>
-    <w:p>
-      <w:pPr>
-        <w:rPr>
-          <w:rFonts w:ascii="Arial" w:hAnsi="Arial" w:cs="Arial"/>
-          <w:sz w:val="28"/>
-          <w:szCs w:val="28"/>
-        </w:rPr>
-      </w:pPr>
-      <w:r>
-        <w:rPr>
-          <w:rFonts w:ascii="Arial" w:hAnsi="Arial" w:cs="Arial"/>
-          <w:sz w:val="28"/>
-          <w:szCs w:val="28"/>
-        </w:rPr>
-        <w:t>{{key_questions}}</w:t>
-      </w:r>
-    </w:p>
-    <w:p>
-      <w:pPr>
-        <w:rPr>
-          <w:rFonts w:ascii="Arial" w:hAnsi="Arial" w:cs="Arial"/>
-          <w:sz w:val="28"/>
-          <w:szCs w:val="28"/>
-          <w:lang w:val="en-US"/>
-        </w:rPr>
-      </w:pPr>
-      <w:r>
-        <w:rPr>
-          <w:rFonts w:ascii="Arial" w:hAnsi="Arial" w:cs="Arial"/>
-          <w:sz w:val="28"/>
-          <w:szCs w:val="28"/>
-          <w:lang w:val="en-US"/>
-        </w:rPr>
-        <w:t>____________________________________________________________</w:t>
-      </w:r>
-    </w:p>
-    <w:p>
-      <w:pPr>
-        <w:rPr>
-          <w:rFonts w:ascii="Arial" w:hAnsi="Arial" w:cs="Arial"/>
-          <w:sz w:val="28"/>
-          <w:szCs w:val="28"/>
-        </w:rPr>
-      </w:pPr>
-      <w:r>
-        <w:rPr>
-          <w:rFonts w:ascii="Arial" w:hAnsi="Arial" w:cs="Arial"/>
-          <w:sz w:val="28"/>
-          <w:szCs w:val="28"/>
-        </w:rPr>
-        <w:t>{{summary}}</w:t>
-      </w:r>
-    </w:p>
-    <w:p>
-      <w:pPr>
-        <w:rPr>
-          <w:rFonts w:ascii="Arial" w:hAnsi="Arial" w:cs="Arial"/>
-          <w:sz w:val="28"/>
-          <w:szCs w:val="28"/>
-        </w:rPr>
-      </w:pPr>
-    </w:p>
-    <w:p>
-      <w:pPr>
-        <w:rPr>
-          <w:rFonts w:ascii="Arial" w:hAnsi="Arial" w:cs="Arial"/>
           <w:b/>
           <w:bCs/>
           <w:sz w:val="28"/>
@@ -250,9 +171,63 @@
           <w:sz w:val="28"/>
           <w:szCs w:val="28"/>
         </w:rPr>
-        <w:t>Поставленные з</w:t>
-      </w:r>
-      <w:r>
+        <w:t>Ключевые вопросы:</w:t>
+      </w:r>
+    </w:p>
+    <w:p>
+      <w:pPr>
+        <w:rPr>
+          <w:rFonts w:ascii="Arial" w:hAnsi="Arial" w:cs="Arial"/>
+          <w:sz w:val="28"/>
+          <w:szCs w:val="28"/>
+        </w:rPr>
+      </w:pPr>
+      <w:r>
+        <w:rPr>
+          <w:rFonts w:ascii="Arial" w:hAnsi="Arial" w:cs="Arial"/>
+          <w:sz w:val="28"/>
+          <w:szCs w:val="28"/>
+        </w:rPr>
+        <w:t>{{key_questions}}</w:t>
+      </w:r>
+    </w:p>
+    <w:p>
+      <w:pPr>
+        <w:rPr>
+          <w:rFonts w:ascii="Arial" w:hAnsi="Arial" w:cs="Arial"/>
+          <w:sz w:val="28"/>
+          <w:szCs w:val="28"/>
+        </w:rPr>
+      </w:pPr>
+    </w:p>
+    <w:p>
+      <w:pPr>
+        <w:rPr>
+          <w:rFonts w:ascii="Arial" w:hAnsi="Arial" w:cs="Arial"/>
+          <w:sz w:val="28"/>
+          <w:szCs w:val="28"/>
+        </w:rPr>
+      </w:pPr>
+      <w:r>
+        <w:rPr>
+          <w:rFonts w:ascii="Arial" w:hAnsi="Arial" w:cs="Arial"/>
+          <w:sz w:val="28"/>
+          <w:szCs w:val="28"/>
+        </w:rPr>
+        <w:t>{{summary}}</w:t>
+      </w:r>
+    </w:p>
+    <w:p>
+      <w:pPr>
+        <w:rPr>
+          <w:rFonts w:ascii="Arial" w:hAnsi="Arial" w:cs="Arial"/>
+          <w:sz w:val="28"/>
+          <w:szCs w:val="28"/>
+        </w:rPr>
+      </w:pPr>
+    </w:p>
+    <w:p>
+      <w:pPr>
         <w:rPr>
           <w:rFonts w:ascii="Arial" w:hAnsi="Arial" w:cs="Arial"/>
           <w:b/>
@@ -260,232 +235,61 @@
           <w:sz w:val="28"/>
           <w:szCs w:val="28"/>
         </w:rPr>
+      </w:pPr>
+      <w:r>
+        <w:rPr>
+          <w:rFonts w:ascii="Arial" w:hAnsi="Arial" w:cs="Arial"/>
+          <w:b/>
+          <w:bCs/>
+          <w:sz w:val="28"/>
+          <w:szCs w:val="28"/>
+        </w:rPr>
+        <w:t>Поставленные з</w:t>
+      </w:r>
+      <w:r>
+        <w:rPr>
+          <w:rFonts w:ascii="Arial" w:hAnsi="Arial" w:cs="Arial"/>
+          <w:b/>
+          <w:bCs/>
+          <w:sz w:val="28"/>
+          <w:szCs w:val="28"/>
+        </w:rPr>
         <w:t>адачи</w:t>
       </w:r>
     </w:p>
-    <w:tbl>
-      <w:tblPr>
-        <w:tblStyle w:val="ac"/>
-        <w:tblW w:w="0" w:type="auto"/>
-        <w:tblLook w:val="04A0" w:firstRow="1" w:lastRow="0" w:firstColumn="1" w:lastColumn="0" w:noHBand="0" w:noVBand="1"/>
-      </w:tblPr>
-      <w:tblGrid>
-        <w:gridCol w:w="3115"/>
-        <w:gridCol w:w="3115"/>
-        <w:gridCol w:w="3115"/>
-      </w:tblGrid>
-      <w:tr>
-        <w:trPr>
-          <w:trHeight w:val="523"/>
-        </w:trPr>
-        <w:tc>
-          <w:tcPr>
-            <w:tcW w:w="3115" w:type="dxa"/>
-            <w:vAlign w:val="center"/>
-          </w:tcPr>
-          <w:p>
-            <w:pPr>
-              <w:jc w:val="center"/>
-              <w:rPr>
-                <w:rFonts w:ascii="Arial" w:hAnsi="Arial" w:cs="Arial"/>
-                <w:sz w:val="28"/>
-                <w:szCs w:val="28"/>
-              </w:rPr>
-            </w:pPr>
-            <w:r>
-              <w:rPr>
-                <w:rFonts w:ascii="Arial" w:hAnsi="Arial" w:cs="Arial"/>
-                <w:sz w:val="28"/>
-                <w:szCs w:val="28"/>
-              </w:rPr>
-              <w:t>Содержание</w:t>
-            </w:r>
-          </w:p>
-        </w:tc>
-        <w:tc>
-          <w:tcPr>
-            <w:tcW w:w="3115" w:type="dxa"/>
-            <w:vAlign w:val="center"/>
-          </w:tcPr>
-          <w:p>
-            <w:pPr>
-              <w:jc w:val="center"/>
-              <w:rPr>
-                <w:rFonts w:ascii="Arial" w:hAnsi="Arial" w:cs="Arial"/>
-                <w:sz w:val="28"/>
-                <w:szCs w:val="28"/>
-              </w:rPr>
-            </w:pPr>
-            <w:r>
-              <w:rPr>
-                <w:rFonts w:ascii="Arial" w:hAnsi="Arial" w:cs="Arial"/>
-                <w:sz w:val="28"/>
-                <w:szCs w:val="28"/>
-              </w:rPr>
-              <w:t>Ответственный</w:t>
-            </w:r>
-          </w:p>
-        </w:tc>
-        <w:tc>
-          <w:tcPr>
-            <w:tcW w:w="3115" w:type="dxa"/>
-            <w:vAlign w:val="center"/>
-          </w:tcPr>
-          <w:p>
-            <w:pPr>
-              <w:jc w:val="center"/>
-              <w:rPr>
-                <w:rFonts w:ascii="Arial" w:hAnsi="Arial" w:cs="Arial"/>
-                <w:sz w:val="28"/>
-                <w:szCs w:val="28"/>
-              </w:rPr>
-            </w:pPr>
-            <w:r>
-              <w:rPr>
-                <w:rFonts w:ascii="Arial" w:hAnsi="Arial" w:cs="Arial"/>
-                <w:sz w:val="28"/>
-                <w:szCs w:val="28"/>
-              </w:rPr>
-              <w:t>Срок выполнения</w:t>
-            </w:r>
-          </w:p>
-        </w:tc>
-      </w:tr>
-      <w:tr>
-        <w:tc>
-          <w:tcPr>
-            <w:tcW w:w="3115" w:type="dxa"/>
-          </w:tcPr>
-          <w:p>
-            <w:pPr>
-              <w:rPr>
-                <w:rFonts w:ascii="Arial" w:hAnsi="Arial" w:cs="Arial"/>
-                <w:sz w:val="28"/>
-                <w:szCs w:val="28"/>
-              </w:rPr>
-            </w:pPr>
-            <w:r>
-              <w:rPr>
-                <w:rFonts w:ascii="Arial" w:hAnsi="Arial" w:cs="Arial"/>
-                <w:sz w:val="28"/>
-                <w:szCs w:val="28"/>
-                <w:lang w:val="en-US"/>
-              </w:rPr>
-              <w:t>{{task</w:t>
-            </w:r>
-            <w:r>
-              <w:rPr>
-                <w:rFonts w:ascii="Arial" w:hAnsi="Arial" w:cs="Arial"/>
-                <w:sz w:val="28"/>
-                <w:szCs w:val="28"/>
-                <w:lang w:val="en-US"/>
-              </w:rPr>
-              <w:t>s</w:t>
-            </w:r>
-            <w:r>
-              <w:rPr>
-                <w:rFonts w:ascii="Arial" w:hAnsi="Arial" w:cs="Arial"/>
-                <w:sz w:val="28"/>
-                <w:szCs w:val="28"/>
-                <w:lang w:val="en-US"/>
-              </w:rPr>
-              <w:t>.content}}</w:t>
-            </w:r>
-          </w:p>
-        </w:tc>
-        <w:tc>
-          <w:tcPr>
-            <w:tcW w:w="3115" w:type="dxa"/>
-          </w:tcPr>
-          <w:p>
-            <w:pPr>
-              <w:rPr>
-                <w:rFonts w:ascii="Arial" w:hAnsi="Arial" w:cs="Arial"/>
-                <w:sz w:val="28"/>
-                <w:szCs w:val="28"/>
-              </w:rPr>
-            </w:pPr>
-            <w:r>
-              <w:rPr>
-                <w:rFonts w:ascii="Arial" w:hAnsi="Arial" w:cs="Arial"/>
-                <w:sz w:val="28"/>
-                <w:szCs w:val="28"/>
-                <w:lang w:val="en-US"/>
-              </w:rPr>
-              <w:t>{{task</w:t>
-            </w:r>
-            <w:r>
-              <w:rPr>
-                <w:rFonts w:ascii="Arial" w:hAnsi="Arial" w:cs="Arial"/>
-                <w:sz w:val="28"/>
-                <w:szCs w:val="28"/>
-                <w:lang w:val="en-US"/>
-              </w:rPr>
-              <w:t>s</w:t>
-            </w:r>
-            <w:r>
-              <w:rPr>
-                <w:rFonts w:ascii="Arial" w:hAnsi="Arial" w:cs="Arial"/>
-                <w:sz w:val="28"/>
-                <w:szCs w:val="28"/>
-                <w:lang w:val="en-US"/>
-              </w:rPr>
-              <w:t>.employee}}</w:t>
-            </w:r>
-          </w:p>
-        </w:tc>
-        <w:tc>
-          <w:tcPr>
-            <w:tcW w:w="3115" w:type="dxa"/>
-          </w:tcPr>
-          <w:p>
-            <w:pPr>
-              <w:rPr>
-                <w:rFonts w:ascii="Arial" w:hAnsi="Arial" w:cs="Arial"/>
-                <w:sz w:val="28"/>
-                <w:szCs w:val="28"/>
-              </w:rPr>
-            </w:pPr>
-            <w:r>
-              <w:rPr>
-                <w:rFonts w:ascii="Arial" w:hAnsi="Arial" w:cs="Arial"/>
-                <w:sz w:val="28"/>
-                <w:szCs w:val="28"/>
-                <w:lang w:val="en-US"/>
-              </w:rPr>
-              <w:t>{{task</w:t>
-            </w:r>
-            <w:r>
-              <w:rPr>
-                <w:rFonts w:ascii="Arial" w:hAnsi="Arial" w:cs="Arial"/>
-                <w:sz w:val="28"/>
-                <w:szCs w:val="28"/>
-                <w:lang w:val="en-US"/>
-              </w:rPr>
-              <w:t>s</w:t>
-            </w:r>
-            <w:r>
-              <w:rPr>
-                <w:rFonts w:ascii="Arial" w:hAnsi="Arial" w:cs="Arial"/>
-                <w:sz w:val="28"/>
-                <w:szCs w:val="28"/>
-                <w:lang w:val="en-US"/>
-              </w:rPr>
-              <w:t>.deadline}}</w:t>
-            </w:r>
-          </w:p>
-        </w:tc>
-      </w:tr>
-    </w:tbl>
-    <w:p>
-      <w:pPr>
+    <w:p>
+      <w:pPr>
+        <w:rPr>
+          <w:rFonts w:ascii="Arial" w:hAnsi="Arial" w:cs="Arial"/>
+          <w:sz w:val="28"/>
+          <w:szCs w:val="28"/>
+        </w:rPr>
+      </w:pPr>
+      <w:r>
+        <w:rPr>
+          <w:rFonts w:ascii="Arial" w:hAnsi="Arial" w:cs="Arial"/>
+          <w:sz w:val="28"/>
+          <w:szCs w:val="28"/>
+        </w:rPr>
+        <w:t>{{</w:t>
+      </w:r>
+      <w:r>
         <w:rPr>
           <w:rFonts w:ascii="Arial" w:hAnsi="Arial" w:cs="Arial"/>
           <w:sz w:val="28"/>
           <w:szCs w:val="28"/>
           <w:lang w:val="en-US"/>
         </w:rPr>
-      </w:pPr>
+        <w:t>tasks</w:t>
+      </w:r>
+      <w:r>
+        <w:rPr>
+          <w:rFonts w:ascii="Arial" w:hAnsi="Arial" w:cs="Arial"/>
+          <w:sz w:val="28"/>
+          <w:szCs w:val="28"/>
+        </w:rPr>
+        <w:t>}}</w:t>
+      </w:r>
     </w:p>
     <w:p>
       <w:pPr>
@@ -501,9 +305,25 @@
           <w:rFonts w:ascii="Arial" w:hAnsi="Arial" w:cs="Arial"/>
           <w:sz w:val="28"/>
           <w:szCs w:val="28"/>
+        </w:rPr>
+        <w:t>{{</w:t>
+      </w:r>
+      <w:r>
+        <w:rPr>
+          <w:rFonts w:ascii="Arial" w:hAnsi="Arial" w:cs="Arial"/>
+          <w:sz w:val="28"/>
+          <w:szCs w:val="28"/>
           <w:lang w:val="en-US"/>
         </w:rPr>
-        <w:t>{{responsible}} / {{n</w:t>
+        <w:t>responsible</w:t>
+      </w:r>
+      <w:r>
+        <w:rPr>
+          <w:rFonts w:ascii="Arial" w:hAnsi="Arial" w:cs="Arial"/>
+          <w:sz w:val="28"/>
+          <w:szCs w:val="28"/>
+        </w:rPr>
+        <w:t>}} / {{</w:t>
       </w:r>
       <w:r>
         <w:rPr>
@@ -512,6 +332,15 @@
           <w:szCs w:val="28"/>
           <w:lang w:val="en-US"/>
         </w:rPr>
+        <w:t>n</w:t>
+      </w:r>
+      <w:r>
+        <w:rPr>
+          <w:rFonts w:ascii="Arial" w:hAnsi="Arial" w:cs="Arial"/>
+          <w:sz w:val="28"/>
+          <w:szCs w:val="28"/>
+          <w:lang w:val="en-US"/>
+        </w:rPr>
         <w:t>o</w:t>
       </w:r>
       <w:r>
@@ -521,8 +350,103 @@
           <w:szCs w:val="28"/>
           <w:lang w:val="en-US"/>
         </w:rPr>
-        <w:t>w_date}}</w:t>
-      </w:r>
+        <w:t>w</w:t>
+      </w:r>
+      <w:r>
+        <w:rPr>
+          <w:rFonts w:ascii="Arial" w:hAnsi="Arial" w:cs="Arial"/>
+          <w:sz w:val="28"/>
+          <w:szCs w:val="28"/>
+        </w:rPr>
+        <w:t>_</w:t>
+      </w:r>
+      <w:r>
+        <w:rPr>
+          <w:rFonts w:ascii="Arial" w:hAnsi="Arial" w:cs="Arial"/>
+          <w:sz w:val="28"/>
+          <w:szCs w:val="28"/>
+          <w:lang w:val="en-US"/>
+        </w:rPr>
+        <w:t>date</w:t>
+      </w:r>
+      <w:r>
+        <w:rPr>
+          <w:rFonts w:ascii="Arial" w:hAnsi="Arial" w:cs="Arial"/>
+          <w:sz w:val="28"/>
+          <w:szCs w:val="28"/>
+        </w:rPr>
+        <w:t>}}</w:t>
+      </w:r>
+    </w:p>
+    <w:p>
+      <w:pPr>
+        <w:jc w:val="right"/>
+        <w:rPr>
+          <w:rFonts w:ascii="Arial" w:hAnsi="Arial" w:cs="Arial"/>
+          <w:sz w:val="28"/>
+          <w:szCs w:val="28"/>
+        </w:rPr>
+      </w:pPr>
+    </w:p>
+    <w:p>
+      <w:pPr>
+        <w:jc w:val="right"/>
+        <w:rPr>
+          <w:rFonts w:ascii="Arial" w:hAnsi="Arial" w:cs="Arial"/>
+          <w:sz w:val="28"/>
+          <w:szCs w:val="28"/>
+        </w:rPr>
+      </w:pPr>
+    </w:p>
+    <w:p>
+      <w:pPr>
+        <w:jc w:val="right"/>
+        <w:rPr>
+          <w:rFonts w:ascii="Arial" w:hAnsi="Arial" w:cs="Arial"/>
+          <w:sz w:val="28"/>
+          <w:szCs w:val="28"/>
+        </w:rPr>
+      </w:pPr>
+    </w:p>
+    <w:p>
+      <w:pPr>
+        <w:jc w:val="right"/>
+        <w:rPr>
+          <w:rFonts w:ascii="Arial" w:hAnsi="Arial" w:cs="Arial"/>
+          <w:sz w:val="28"/>
+          <w:szCs w:val="28"/>
+        </w:rPr>
+      </w:pPr>
+    </w:p>
+    <w:p>
+      <w:pPr>
+        <w:jc w:val="right"/>
+        <w:rPr>
+          <w:rFonts w:ascii="Arial" w:hAnsi="Arial" w:cs="Arial"/>
+          <w:sz w:val="28"/>
+          <w:szCs w:val="28"/>
+        </w:rPr>
+      </w:pPr>
+    </w:p>
+    <w:p>
+      <w:pPr>
+        <w:jc w:val="right"/>
+        <w:rPr>
+          <w:rFonts w:ascii="Arial" w:hAnsi="Arial" w:cs="Arial"/>
+          <w:sz w:val="28"/>
+          <w:szCs w:val="28"/>
+        </w:rPr>
+      </w:pPr>
+    </w:p>
+    <w:p>
+      <w:pPr>
+        <w:jc w:val="right"/>
+        <w:rPr>
+          <w:rFonts w:ascii="Arial" w:hAnsi="Arial" w:cs="Arial"/>
+          <w:sz w:val="28"/>
+          <w:szCs w:val="28"/>
+        </w:rPr>
+      </w:pPr>
     </w:p>
     <w:sectPr>
       <w:pgSz w:w="11906" w:h="16838"/>

</xml_diff>